<commit_message>
stuff that never got committed
</commit_message>
<xml_diff>
--- a/output/StandardsList-media-table.docx
+++ b/output/StandardsList-media-table.docx
@@ -1596,7 +1596,7 @@
               <w:jc w:val="left"/>
             </w:pPr>
             <w:r>
-              <w:t xml:space="preserve">Spawning ai.txt</w:t>
+              <w:t xml:space="preserve">ai.txt</w:t>
             </w:r>
           </w:p>
         </w:tc>
@@ -1706,7 +1706,7 @@
               <w:jc w:val="left"/>
             </w:pPr>
             <w:r>
-              <w:t xml:space="preserve">Robots.txt</w:t>
+              <w:t xml:space="preserve">Robots Exclusion Protocol</w:t>
             </w:r>
           </w:p>
         </w:tc>
@@ -3594,85 +3594,7 @@
               <w:jc w:val="left"/>
             </w:pPr>
             <w:r>
-              <w:t xml:space="preserve">Recommended Practices for</w:t>
-            </w:r>
-          </w:p>
-        </w:tc>
-        <w:tc>
-          <w:tcPr/>
-          <w:p>
-            <w:pPr>
-              <w:pStyle w:val="Compact"/>
-            </w:pPr>
-          </w:p>
-        </w:tc>
-        <w:tc>
-          <w:tcPr/>
-          <w:p>
-            <w:pPr>
-              <w:pStyle w:val="Compact"/>
-            </w:pPr>
-          </w:p>
-        </w:tc>
-        <w:tc>
-          <w:tcPr/>
-          <w:p>
-            <w:pPr>
-              <w:pStyle w:val="Compact"/>
-            </w:pPr>
-          </w:p>
-        </w:tc>
-        <w:tc>
-          <w:tcPr/>
-          <w:p>
-            <w:pPr>
-              <w:pStyle w:val="Compact"/>
-            </w:pPr>
-          </w:p>
-        </w:tc>
-        <w:tc>
-          <w:tcPr/>
-          <w:p>
-            <w:pPr>
-              <w:pStyle w:val="Compact"/>
-            </w:pPr>
-          </w:p>
-        </w:tc>
-        <w:tc>
-          <w:tcPr/>
-          <w:p>
-            <w:pPr>
-              <w:pStyle w:val="Compact"/>
-            </w:pPr>
-          </w:p>
-        </w:tc>
-        <w:tc>
-          <w:tcPr/>
-          <w:p>
-            <w:pPr>
-              <w:pStyle w:val="Compact"/>
-            </w:pPr>
-          </w:p>
-        </w:tc>
-        <w:tc>
-          <w:tcPr/>
-          <w:p>
-            <w:pPr>
-              <w:pStyle w:val="Compact"/>
-            </w:pPr>
-          </w:p>
-        </w:tc>
-      </w:tr>
-      <w:tr>
-        <w:tc>
-          <w:tcPr/>
-          <w:p>
-            <w:pPr>
-              <w:pStyle w:val="Compact"/>
-              <w:jc w:val="left"/>
-            </w:pPr>
-            <w:r>
-              <w:t xml:space="preserve">Levels of Artificial Intelligence Generated Content Technologies</w:t>
+              <w:t xml:space="preserve">Recommended Practices for Levels of Artificial Intelligence Generated Content Technologies</w:t>
             </w:r>
           </w:p>
         </w:tc>

</xml_diff>